<commit_message>
making work enhancedAI datapack
</commit_message>
<xml_diff>
--- a/опись модов и шейдеров.docx
+++ b/опись модов и шейдеров.docx
@@ -763,7 +763,6 @@
         <w:rPr>
           <w:sz w:val="32"/>
           <w:szCs w:val="32"/>
-          <w:lang w:val="en-US"/>
         </w:rPr>
       </w:pPr>
       <w:r>
@@ -778,7 +777,6 @@
         <w:rPr>
           <w:sz w:val="32"/>
           <w:szCs w:val="32"/>
-          <w:lang w:val="en-US"/>
         </w:rPr>
         <w:t xml:space="preserve"> (</w:t>
       </w:r>
@@ -797,7 +795,6 @@
           <w:bCs/>
           <w:sz w:val="32"/>
           <w:szCs w:val="32"/>
-          <w:lang w:val="en-US"/>
         </w:rPr>
         <w:t xml:space="preserve"> </w:t>
       </w:r>
@@ -816,7 +813,6 @@
           <w:bCs/>
           <w:sz w:val="32"/>
           <w:szCs w:val="32"/>
-          <w:lang w:val="en-US"/>
         </w:rPr>
         <w:t xml:space="preserve"> </w:t>
       </w:r>
@@ -836,7 +832,6 @@
           <w:bCs/>
           <w:sz w:val="32"/>
           <w:szCs w:val="32"/>
-          <w:lang w:val="en-US"/>
         </w:rPr>
         <w:t xml:space="preserve"> </w:t>
       </w:r>
@@ -854,7 +849,6 @@
         <w:rPr>
           <w:sz w:val="32"/>
           <w:szCs w:val="32"/>
-          <w:lang w:val="en-US"/>
         </w:rPr>
         <w:t>)</w:t>
       </w:r>
@@ -1316,6 +1310,53 @@
           <w:szCs w:val="32"/>
           <w:lang w:val="en-US"/>
         </w:rPr>
+        <w:t>Custom Mob Attributes (</w:t>
+      </w:r>
+      <w:r>
+        <w:rPr>
+          <w:sz w:val="32"/>
+          <w:szCs w:val="32"/>
+        </w:rPr>
+        <w:t>НАСТРОЙКА</w:t>
+      </w:r>
+      <w:r>
+        <w:rPr>
+          <w:sz w:val="32"/>
+          <w:szCs w:val="32"/>
+          <w:lang w:val="en-US"/>
+        </w:rPr>
+        <w:t xml:space="preserve"> </w:t>
+      </w:r>
+      <w:r>
+        <w:rPr>
+          <w:sz w:val="32"/>
+          <w:szCs w:val="32"/>
+        </w:rPr>
+        <w:t>МОБОВ</w:t>
+      </w:r>
+      <w:r>
+        <w:rPr>
+          <w:sz w:val="32"/>
+          <w:szCs w:val="32"/>
+          <w:lang w:val="en-US"/>
+        </w:rPr>
+        <w:t>)</w:t>
+      </w:r>
+    </w:p>
+    <w:p>
+      <w:pPr>
+        <w:rPr>
+          <w:sz w:val="32"/>
+          <w:szCs w:val="32"/>
+          <w:lang w:val="en-US"/>
+        </w:rPr>
+      </w:pPr>
+      <w:r>
+        <w:rPr>
+          <w:sz w:val="32"/>
+          <w:szCs w:val="32"/>
+          <w:lang w:val="en-US"/>
+        </w:rPr>
         <w:t>Born in Chaos</w:t>
       </w:r>
     </w:p>
@@ -1508,6 +1549,7 @@
           <w:szCs w:val="32"/>
           <w:lang w:val="en-US"/>
         </w:rPr>
+        <w:lastRenderedPageBreak/>
         <w:t>Dynamic</w:t>
       </w:r>
       <w:r>
@@ -1564,7 +1606,6 @@
           <w:szCs w:val="32"/>
           <w:lang w:val="en-US"/>
         </w:rPr>
-        <w:lastRenderedPageBreak/>
         <w:t>Async Particles (</w:t>
       </w:r>
       <w:r>
@@ -1730,23 +1771,6 @@
           <w:lang w:val="en-US"/>
         </w:rPr>
         <w:t>Epic Fight Indestructible</w:t>
-      </w:r>
-    </w:p>
-    <w:p>
-      <w:pPr>
-        <w:rPr>
-          <w:sz w:val="32"/>
-          <w:szCs w:val="32"/>
-          <w:lang w:val="en-US"/>
-        </w:rPr>
-      </w:pPr>
-      <w:r>
-        <w:rPr>
-          <w:sz w:val="32"/>
-          <w:szCs w:val="32"/>
-          <w:lang w:val="en-US"/>
-        </w:rPr>
-        <w:t>Midnight Madness</w:t>
       </w:r>
     </w:p>
     <w:p>

</xml_diff>

<commit_message>
huge fixes and work on scripts; made own mod
</commit_message>
<xml_diff>
--- a/опись модов и шейдеров.docx
+++ b/опись модов и шейдеров.docx
@@ -622,6 +622,40 @@
           <w:szCs w:val="32"/>
           <w:lang w:val="en-US"/>
         </w:rPr>
+        <w:t>Xaero’s Minimap</w:t>
+      </w:r>
+    </w:p>
+    <w:p>
+      <w:pPr>
+        <w:rPr>
+          <w:sz w:val="32"/>
+          <w:szCs w:val="32"/>
+          <w:lang w:val="en-US"/>
+        </w:rPr>
+      </w:pPr>
+      <w:r>
+        <w:rPr>
+          <w:sz w:val="32"/>
+          <w:szCs w:val="32"/>
+          <w:lang w:val="en-US"/>
+        </w:rPr>
+        <w:t>Xaero’s Worldmap</w:t>
+      </w:r>
+    </w:p>
+    <w:p>
+      <w:pPr>
+        <w:rPr>
+          <w:sz w:val="32"/>
+          <w:szCs w:val="32"/>
+          <w:lang w:val="en-US"/>
+        </w:rPr>
+      </w:pPr>
+      <w:r>
+        <w:rPr>
+          <w:sz w:val="32"/>
+          <w:szCs w:val="32"/>
+          <w:lang w:val="en-US"/>
+        </w:rPr>
         <w:t>Puffish Attributes</w:t>
       </w:r>
     </w:p>
@@ -656,6 +690,77 @@
           <w:szCs w:val="32"/>
           <w:lang w:val="en-US"/>
         </w:rPr>
+        <w:t xml:space="preserve">Epic Fight </w:t>
+      </w:r>
+      <w:r>
+        <w:rPr>
+          <w:sz w:val="32"/>
+          <w:szCs w:val="32"/>
+          <w:lang w:val="en-US"/>
+        </w:rPr>
+        <w:t>Some Tweaks and Fixes</w:t>
+      </w:r>
+      <w:r>
+        <w:rPr>
+          <w:sz w:val="32"/>
+          <w:szCs w:val="32"/>
+          <w:lang w:val="en-US"/>
+        </w:rPr>
+        <w:t xml:space="preserve"> </w:t>
+      </w:r>
+      <w:r>
+        <w:rPr>
+          <w:sz w:val="32"/>
+          <w:szCs w:val="32"/>
+          <w:lang w:val="en-US"/>
+        </w:rPr>
+        <w:t>(</w:t>
+      </w:r>
+      <w:r>
+        <w:rPr>
+          <w:sz w:val="32"/>
+          <w:szCs w:val="32"/>
+        </w:rPr>
+        <w:t>СВОЙ</w:t>
+      </w:r>
+      <w:r>
+        <w:rPr>
+          <w:sz w:val="32"/>
+          <w:szCs w:val="32"/>
+          <w:lang w:val="en-US"/>
+        </w:rPr>
+        <w:t xml:space="preserve"> </w:t>
+      </w:r>
+      <w:r>
+        <w:rPr>
+          <w:sz w:val="32"/>
+          <w:szCs w:val="32"/>
+        </w:rPr>
+        <w:t>СОБСТВЕННЫЙ</w:t>
+      </w:r>
+      <w:r>
+        <w:rPr>
+          <w:sz w:val="32"/>
+          <w:szCs w:val="32"/>
+          <w:lang w:val="en-US"/>
+        </w:rPr>
+        <w:t>)</w:t>
+      </w:r>
+    </w:p>
+    <w:p>
+      <w:pPr>
+        <w:rPr>
+          <w:sz w:val="32"/>
+          <w:szCs w:val="32"/>
+          <w:lang w:val="en-US"/>
+        </w:rPr>
+      </w:pPr>
+      <w:r>
+        <w:rPr>
+          <w:sz w:val="32"/>
+          <w:szCs w:val="32"/>
+          <w:lang w:val="en-US"/>
+        </w:rPr>
         <w:t>Tons of Enchants</w:t>
       </w:r>
     </w:p>
@@ -763,20 +868,23 @@
         <w:rPr>
           <w:sz w:val="32"/>
           <w:szCs w:val="32"/>
-        </w:rPr>
-      </w:pPr>
-      <w:r>
-        <w:rPr>
-          <w:sz w:val="32"/>
-          <w:szCs w:val="32"/>
-          <w:lang w:val="en-US"/>
-        </w:rPr>
+          <w:lang w:val="en-US"/>
+        </w:rPr>
+      </w:pPr>
+      <w:r>
+        <w:rPr>
+          <w:sz w:val="32"/>
+          <w:szCs w:val="32"/>
+          <w:lang w:val="en-US"/>
+        </w:rPr>
+        <w:lastRenderedPageBreak/>
         <w:t>Apotheosis</w:t>
       </w:r>
       <w:r>
         <w:rPr>
           <w:sz w:val="32"/>
           <w:szCs w:val="32"/>
+          <w:lang w:val="en-US"/>
         </w:rPr>
         <w:t xml:space="preserve"> (</w:t>
       </w:r>
@@ -795,6 +903,7 @@
           <w:bCs/>
           <w:sz w:val="32"/>
           <w:szCs w:val="32"/>
+          <w:lang w:val="en-US"/>
         </w:rPr>
         <w:t xml:space="preserve"> </w:t>
       </w:r>
@@ -813,6 +922,7 @@
           <w:bCs/>
           <w:sz w:val="32"/>
           <w:szCs w:val="32"/>
+          <w:lang w:val="en-US"/>
         </w:rPr>
         <w:t xml:space="preserve"> </w:t>
       </w:r>
@@ -832,6 +942,7 @@
           <w:bCs/>
           <w:sz w:val="32"/>
           <w:szCs w:val="32"/>
+          <w:lang w:val="en-US"/>
         </w:rPr>
         <w:t xml:space="preserve"> </w:t>
       </w:r>
@@ -849,6 +960,7 @@
         <w:rPr>
           <w:sz w:val="32"/>
           <w:szCs w:val="32"/>
+          <w:lang w:val="en-US"/>
         </w:rPr>
         <w:t>)</w:t>
       </w:r>
@@ -901,59 +1013,542 @@
           <w:szCs w:val="32"/>
           <w:lang w:val="en-US"/>
         </w:rPr>
+        <w:t>Jade</w:t>
+      </w:r>
+    </w:p>
+    <w:p>
+      <w:pPr>
+        <w:rPr>
+          <w:sz w:val="32"/>
+          <w:szCs w:val="32"/>
+          <w:lang w:val="en-US"/>
+        </w:rPr>
+      </w:pPr>
+      <w:r>
+        <w:rPr>
+          <w:sz w:val="32"/>
+          <w:szCs w:val="32"/>
+          <w:lang w:val="en-US"/>
+        </w:rPr>
+        <w:t>JEI</w:t>
+      </w:r>
+    </w:p>
+    <w:p>
+      <w:pPr>
+        <w:rPr>
+          <w:sz w:val="32"/>
+          <w:szCs w:val="32"/>
+          <w:lang w:val="en-US"/>
+        </w:rPr>
+      </w:pPr>
+      <w:r>
+        <w:rPr>
+          <w:sz w:val="32"/>
+          <w:szCs w:val="32"/>
+          <w:lang w:val="en-US"/>
+        </w:rPr>
+        <w:t>JER</w:t>
+      </w:r>
+    </w:p>
+    <w:p>
+      <w:pPr>
+        <w:rPr>
+          <w:sz w:val="32"/>
+          <w:szCs w:val="32"/>
+          <w:lang w:val="en-US"/>
+        </w:rPr>
+      </w:pPr>
+      <w:r>
+        <w:rPr>
+          <w:sz w:val="32"/>
+          <w:szCs w:val="32"/>
+          <w:lang w:val="en-US"/>
+        </w:rPr>
+        <w:t>Oculus</w:t>
+      </w:r>
+      <w:r>
+        <w:rPr>
+          <w:sz w:val="32"/>
+          <w:szCs w:val="32"/>
+          <w:lang w:val="en-US"/>
+        </w:rPr>
+        <w:t xml:space="preserve"> (</w:t>
+      </w:r>
+      <w:r>
+        <w:rPr>
+          <w:sz w:val="32"/>
+          <w:szCs w:val="32"/>
+        </w:rPr>
+        <w:t>ВИЗУАЛ</w:t>
+      </w:r>
+      <w:r>
+        <w:rPr>
+          <w:sz w:val="32"/>
+          <w:szCs w:val="32"/>
+          <w:lang w:val="en-US"/>
+        </w:rPr>
+        <w:t>)</w:t>
+      </w:r>
+    </w:p>
+    <w:p>
+      <w:pPr>
+        <w:rPr>
+          <w:sz w:val="32"/>
+          <w:szCs w:val="32"/>
+          <w:lang w:val="en-US"/>
+        </w:rPr>
+      </w:pPr>
+      <w:r>
+        <w:rPr>
+          <w:sz w:val="32"/>
+          <w:szCs w:val="32"/>
+          <w:lang w:val="en-US"/>
+        </w:rPr>
+        <w:t>Useful Backpacks</w:t>
+      </w:r>
+    </w:p>
+    <w:p>
+      <w:pPr>
+        <w:rPr>
+          <w:sz w:val="32"/>
+          <w:szCs w:val="32"/>
+          <w:lang w:val="en-US"/>
+        </w:rPr>
+      </w:pPr>
+      <w:r>
+        <w:rPr>
+          <w:sz w:val="32"/>
+          <w:szCs w:val="32"/>
+          <w:lang w:val="en-US"/>
+        </w:rPr>
+        <w:t>Epic Fight</w:t>
+      </w:r>
+    </w:p>
+    <w:p>
+      <w:pPr>
+        <w:rPr>
+          <w:sz w:val="32"/>
+          <w:szCs w:val="32"/>
+          <w:lang w:val="en-US"/>
+        </w:rPr>
+      </w:pPr>
+      <w:r>
+        <w:rPr>
+          <w:sz w:val="32"/>
+          <w:szCs w:val="32"/>
+          <w:lang w:val="en-US"/>
+        </w:rPr>
+        <w:t>Block Factory’s Bioomes</w:t>
+      </w:r>
+    </w:p>
+    <w:p>
+      <w:pPr>
+        <w:rPr>
+          <w:sz w:val="32"/>
+          <w:szCs w:val="32"/>
+          <w:lang w:val="en-US"/>
+        </w:rPr>
+      </w:pPr>
+      <w:r>
+        <w:rPr>
+          <w:sz w:val="32"/>
+          <w:szCs w:val="32"/>
+          <w:lang w:val="en-US"/>
+        </w:rPr>
+        <w:t>Quark</w:t>
+      </w:r>
+    </w:p>
+    <w:p>
+      <w:pPr>
+        <w:rPr>
+          <w:sz w:val="32"/>
+          <w:szCs w:val="32"/>
+          <w:lang w:val="en-US"/>
+        </w:rPr>
+      </w:pPr>
+      <w:r>
+        <w:rPr>
+          <w:sz w:val="32"/>
+          <w:szCs w:val="32"/>
+          <w:lang w:val="en-US"/>
+        </w:rPr>
+        <w:t>Quark Oddities</w:t>
+      </w:r>
+    </w:p>
+    <w:p>
+      <w:pPr>
+        <w:rPr>
+          <w:sz w:val="32"/>
+          <w:szCs w:val="32"/>
+          <w:lang w:val="en-US"/>
+        </w:rPr>
+      </w:pPr>
+      <w:r>
+        <w:rPr>
+          <w:sz w:val="32"/>
+          <w:szCs w:val="32"/>
+          <w:lang w:val="en-US"/>
+        </w:rPr>
+        <w:t>Gravestone</w:t>
+      </w:r>
+    </w:p>
+    <w:p>
+      <w:pPr>
+        <w:rPr>
+          <w:sz w:val="32"/>
+          <w:szCs w:val="32"/>
+          <w:lang w:val="en-US"/>
+        </w:rPr>
+      </w:pPr>
+      <w:r>
+        <w:rPr>
+          <w:sz w:val="32"/>
+          <w:szCs w:val="32"/>
+          <w:lang w:val="en-US"/>
+        </w:rPr>
+        <w:t xml:space="preserve">Ferrite Core </w:t>
+      </w:r>
+      <w:r>
+        <w:rPr>
+          <w:sz w:val="32"/>
+          <w:szCs w:val="32"/>
+          <w:lang w:val="en-US"/>
+        </w:rPr>
+        <w:t>(</w:t>
+      </w:r>
+      <w:r>
+        <w:rPr>
+          <w:sz w:val="32"/>
+          <w:szCs w:val="32"/>
+        </w:rPr>
+        <w:t>ОПТИМИЗАЦИЯ</w:t>
+      </w:r>
+      <w:r>
+        <w:rPr>
+          <w:sz w:val="32"/>
+          <w:szCs w:val="32"/>
+          <w:lang w:val="en-US"/>
+        </w:rPr>
+        <w:t>)</w:t>
+      </w:r>
+    </w:p>
+    <w:p>
+      <w:pPr>
+        <w:rPr>
+          <w:sz w:val="32"/>
+          <w:szCs w:val="32"/>
+          <w:lang w:val="en-US"/>
+        </w:rPr>
+      </w:pPr>
+      <w:r>
+        <w:rPr>
+          <w:sz w:val="32"/>
+          <w:szCs w:val="32"/>
+          <w:lang w:val="en-US"/>
+        </w:rPr>
+        <w:t>ModernF</w:t>
+      </w:r>
+      <w:r>
+        <w:rPr>
+          <w:sz w:val="32"/>
+          <w:szCs w:val="32"/>
+          <w:lang w:val="en-US"/>
+        </w:rPr>
+        <w:t>i</w:t>
+      </w:r>
+      <w:r>
+        <w:rPr>
+          <w:sz w:val="32"/>
+          <w:szCs w:val="32"/>
+          <w:lang w:val="en-US"/>
+        </w:rPr>
+        <w:t xml:space="preserve">x </w:t>
+      </w:r>
+      <w:r>
+        <w:rPr>
+          <w:sz w:val="32"/>
+          <w:szCs w:val="32"/>
+          <w:lang w:val="en-US"/>
+        </w:rPr>
+        <w:t>(</w:t>
+      </w:r>
+      <w:r>
+        <w:rPr>
+          <w:sz w:val="32"/>
+          <w:szCs w:val="32"/>
+        </w:rPr>
+        <w:t>ОПТИМИЗАЦИЯ</w:t>
+      </w:r>
+      <w:r>
+        <w:rPr>
+          <w:sz w:val="32"/>
+          <w:szCs w:val="32"/>
+          <w:lang w:val="en-US"/>
+        </w:rPr>
+        <w:t>)</w:t>
+      </w:r>
+    </w:p>
+    <w:p>
+      <w:pPr>
+        <w:rPr>
+          <w:sz w:val="32"/>
+          <w:szCs w:val="32"/>
+          <w:lang w:val="en-US"/>
+        </w:rPr>
+      </w:pPr>
+      <w:r>
+        <w:rPr>
+          <w:sz w:val="32"/>
+          <w:szCs w:val="32"/>
+          <w:lang w:val="en-US"/>
+        </w:rPr>
+        <w:t>GlobalXP</w:t>
+      </w:r>
+    </w:p>
+    <w:p>
+      <w:pPr>
+        <w:rPr>
+          <w:sz w:val="32"/>
+          <w:szCs w:val="32"/>
+          <w:lang w:val="en-US"/>
+        </w:rPr>
+      </w:pPr>
+      <w:r>
+        <w:rPr>
+          <w:sz w:val="32"/>
+          <w:szCs w:val="32"/>
+          <w:lang w:val="en-US"/>
+        </w:rPr>
+        <w:t>Multi Mine</w:t>
+      </w:r>
+    </w:p>
+    <w:p>
+      <w:pPr>
+        <w:rPr>
+          <w:sz w:val="32"/>
+          <w:szCs w:val="32"/>
+          <w:lang w:val="en-US"/>
+        </w:rPr>
+      </w:pPr>
+      <w:r>
+        <w:rPr>
+          <w:sz w:val="32"/>
+          <w:szCs w:val="32"/>
+          <w:lang w:val="en-US"/>
+        </w:rPr>
+        <w:t>Sound Physics Remastered</w:t>
+      </w:r>
+    </w:p>
+    <w:p>
+      <w:pPr>
+        <w:rPr>
+          <w:sz w:val="32"/>
+          <w:szCs w:val="32"/>
+          <w:lang w:val="en-US"/>
+        </w:rPr>
+      </w:pPr>
+      <w:r>
+        <w:rPr>
+          <w:sz w:val="32"/>
+          <w:szCs w:val="32"/>
+          <w:lang w:val="en-US"/>
+        </w:rPr>
+        <w:t>Ice and Fire</w:t>
+      </w:r>
+    </w:p>
+    <w:p>
+      <w:pPr>
+        <w:rPr>
+          <w:sz w:val="32"/>
+          <w:szCs w:val="32"/>
+          <w:lang w:val="en-US"/>
+        </w:rPr>
+      </w:pPr>
+      <w:r>
+        <w:rPr>
+          <w:sz w:val="32"/>
+          <w:szCs w:val="32"/>
+          <w:lang w:val="en-US"/>
+        </w:rPr>
+        <w:t>EFM Compat</w:t>
+      </w:r>
+    </w:p>
+    <w:p>
+      <w:pPr>
+        <w:rPr>
+          <w:sz w:val="32"/>
+          <w:szCs w:val="32"/>
+          <w:lang w:val="en-US"/>
+        </w:rPr>
+      </w:pPr>
+      <w:r>
+        <w:rPr>
+          <w:sz w:val="32"/>
+          <w:szCs w:val="32"/>
+          <w:lang w:val="en-US"/>
+        </w:rPr>
+        <w:t>Visual Keybinder</w:t>
+      </w:r>
+    </w:p>
+    <w:p>
+      <w:pPr>
+        <w:rPr>
+          <w:sz w:val="32"/>
+          <w:szCs w:val="32"/>
+          <w:lang w:val="en-US"/>
+        </w:rPr>
+      </w:pPr>
+      <w:r>
+        <w:rPr>
+          <w:sz w:val="32"/>
+          <w:szCs w:val="32"/>
+          <w:lang w:val="en-US"/>
+        </w:rPr>
+        <w:t>Custom Mob Attributes (</w:t>
+      </w:r>
+      <w:r>
+        <w:rPr>
+          <w:sz w:val="32"/>
+          <w:szCs w:val="32"/>
+        </w:rPr>
+        <w:t>НАСТРОЙКА</w:t>
+      </w:r>
+      <w:r>
+        <w:rPr>
+          <w:sz w:val="32"/>
+          <w:szCs w:val="32"/>
+          <w:lang w:val="en-US"/>
+        </w:rPr>
+        <w:t xml:space="preserve"> </w:t>
+      </w:r>
+      <w:r>
+        <w:rPr>
+          <w:sz w:val="32"/>
+          <w:szCs w:val="32"/>
+        </w:rPr>
+        <w:t>МОБОВ</w:t>
+      </w:r>
+      <w:r>
+        <w:rPr>
+          <w:sz w:val="32"/>
+          <w:szCs w:val="32"/>
+          <w:lang w:val="en-US"/>
+        </w:rPr>
+        <w:t>)</w:t>
+      </w:r>
+    </w:p>
+    <w:p>
+      <w:pPr>
+        <w:rPr>
+          <w:sz w:val="32"/>
+          <w:szCs w:val="32"/>
+          <w:lang w:val="en-US"/>
+        </w:rPr>
+      </w:pPr>
+      <w:r>
+        <w:rPr>
+          <w:sz w:val="32"/>
+          <w:szCs w:val="32"/>
+          <w:lang w:val="en-US"/>
+        </w:rPr>
+        <w:t>Born in Chaos</w:t>
+      </w:r>
+    </w:p>
+    <w:p>
+      <w:pPr>
+        <w:rPr>
+          <w:sz w:val="32"/>
+          <w:szCs w:val="32"/>
+          <w:lang w:val="en-US"/>
+        </w:rPr>
+      </w:pPr>
+      <w:r>
+        <w:rPr>
+          <w:sz w:val="32"/>
+          <w:szCs w:val="32"/>
+          <w:lang w:val="en-US"/>
+        </w:rPr>
+        <w:t>Embeddium (</w:t>
+      </w:r>
+      <w:r>
+        <w:rPr>
+          <w:sz w:val="32"/>
+          <w:szCs w:val="32"/>
+        </w:rPr>
+        <w:t>ИНТЕРФЕЙС</w:t>
+      </w:r>
+      <w:r>
+        <w:rPr>
+          <w:sz w:val="32"/>
+          <w:szCs w:val="32"/>
+          <w:lang w:val="en-US"/>
+        </w:rPr>
+        <w:t xml:space="preserve"> </w:t>
+      </w:r>
+      <w:r>
+        <w:rPr>
+          <w:sz w:val="32"/>
+          <w:szCs w:val="32"/>
+        </w:rPr>
+        <w:t>ШЕЙДЕРОВ</w:t>
+      </w:r>
+      <w:r>
+        <w:rPr>
+          <w:sz w:val="32"/>
+          <w:szCs w:val="32"/>
+          <w:lang w:val="en-US"/>
+        </w:rPr>
+        <w:t>)</w:t>
+      </w:r>
+    </w:p>
+    <w:p>
+      <w:pPr>
+        <w:rPr>
+          <w:sz w:val="32"/>
+          <w:szCs w:val="32"/>
+          <w:lang w:val="en-US"/>
+        </w:rPr>
+      </w:pPr>
+      <w:r>
+        <w:rPr>
+          <w:sz w:val="32"/>
+          <w:szCs w:val="32"/>
+          <w:lang w:val="en-US"/>
+        </w:rPr>
+        <w:t>Starlight (</w:t>
+      </w:r>
+      <w:r>
+        <w:rPr>
+          <w:sz w:val="32"/>
+          <w:szCs w:val="32"/>
+        </w:rPr>
+        <w:t>ОПТИМИЗАЦИЯ</w:t>
+      </w:r>
+      <w:r>
+        <w:rPr>
+          <w:sz w:val="32"/>
+          <w:szCs w:val="32"/>
+          <w:lang w:val="en-US"/>
+        </w:rPr>
+        <w:t>)</w:t>
+      </w:r>
+    </w:p>
+    <w:p>
+      <w:pPr>
+        <w:rPr>
+          <w:sz w:val="32"/>
+          <w:szCs w:val="32"/>
+          <w:lang w:val="en-US"/>
+        </w:rPr>
+      </w:pPr>
+      <w:r>
+        <w:rPr>
+          <w:sz w:val="32"/>
+          <w:szCs w:val="32"/>
+          <w:lang w:val="en-US"/>
+        </w:rPr>
         <w:lastRenderedPageBreak/>
-        <w:t>Jade</w:t>
-      </w:r>
-    </w:p>
-    <w:p>
-      <w:pPr>
-        <w:rPr>
-          <w:sz w:val="32"/>
-          <w:szCs w:val="32"/>
-          <w:lang w:val="en-US"/>
-        </w:rPr>
-      </w:pPr>
-      <w:r>
-        <w:rPr>
-          <w:sz w:val="32"/>
-          <w:szCs w:val="32"/>
-          <w:lang w:val="en-US"/>
-        </w:rPr>
-        <w:t>JEI</w:t>
-      </w:r>
-    </w:p>
-    <w:p>
-      <w:pPr>
-        <w:rPr>
-          <w:sz w:val="32"/>
-          <w:szCs w:val="32"/>
-          <w:lang w:val="en-US"/>
-        </w:rPr>
-      </w:pPr>
-      <w:r>
-        <w:rPr>
-          <w:sz w:val="32"/>
-          <w:szCs w:val="32"/>
-          <w:lang w:val="en-US"/>
-        </w:rPr>
-        <w:t>JER</w:t>
-      </w:r>
-    </w:p>
-    <w:p>
-      <w:pPr>
-        <w:rPr>
-          <w:sz w:val="32"/>
-          <w:szCs w:val="32"/>
-          <w:lang w:val="en-US"/>
-        </w:rPr>
-      </w:pPr>
-      <w:r>
-        <w:rPr>
-          <w:sz w:val="32"/>
-          <w:szCs w:val="32"/>
-          <w:lang w:val="en-US"/>
-        </w:rPr>
-        <w:t>Oculus</w:t>
+        <w:t>Canary</w:t>
       </w:r>
       <w:r>
         <w:rPr>
@@ -968,7 +1563,7 @@
           <w:sz w:val="32"/>
           <w:szCs w:val="32"/>
         </w:rPr>
-        <w:t>ВИЗУАЛ</w:t>
+        <w:t>ОПТИМИЗАЦИЯ</w:t>
       </w:r>
       <w:r>
         <w:rPr>
@@ -993,117 +1588,31 @@
           <w:szCs w:val="32"/>
           <w:lang w:val="en-US"/>
         </w:rPr>
-        <w:t>Useful Backpacks</w:t>
-      </w:r>
-    </w:p>
-    <w:p>
-      <w:pPr>
-        <w:rPr>
-          <w:sz w:val="32"/>
-          <w:szCs w:val="32"/>
-          <w:lang w:val="en-US"/>
-        </w:rPr>
-      </w:pPr>
-      <w:r>
-        <w:rPr>
-          <w:sz w:val="32"/>
-          <w:szCs w:val="32"/>
-          <w:lang w:val="en-US"/>
-        </w:rPr>
-        <w:t>Epic Fight</w:t>
-      </w:r>
-    </w:p>
-    <w:p>
-      <w:pPr>
-        <w:rPr>
-          <w:sz w:val="32"/>
-          <w:szCs w:val="32"/>
-          <w:lang w:val="en-US"/>
-        </w:rPr>
-      </w:pPr>
-      <w:r>
-        <w:rPr>
-          <w:sz w:val="32"/>
-          <w:szCs w:val="32"/>
-          <w:lang w:val="en-US"/>
-        </w:rPr>
-        <w:t>Block Factory’s Bioomes</w:t>
-      </w:r>
-    </w:p>
-    <w:p>
-      <w:pPr>
-        <w:rPr>
-          <w:sz w:val="32"/>
-          <w:szCs w:val="32"/>
-          <w:lang w:val="en-US"/>
-        </w:rPr>
-      </w:pPr>
-      <w:r>
-        <w:rPr>
-          <w:sz w:val="32"/>
-          <w:szCs w:val="32"/>
-          <w:lang w:val="en-US"/>
-        </w:rPr>
-        <w:t>Quark</w:t>
-      </w:r>
-    </w:p>
-    <w:p>
-      <w:pPr>
-        <w:rPr>
-          <w:sz w:val="32"/>
-          <w:szCs w:val="32"/>
-          <w:lang w:val="en-US"/>
-        </w:rPr>
-      </w:pPr>
-      <w:r>
-        <w:rPr>
-          <w:sz w:val="32"/>
-          <w:szCs w:val="32"/>
-          <w:lang w:val="en-US"/>
-        </w:rPr>
-        <w:t>Quark Oddities</w:t>
-      </w:r>
-    </w:p>
-    <w:p>
-      <w:pPr>
-        <w:rPr>
-          <w:sz w:val="32"/>
-          <w:szCs w:val="32"/>
-          <w:lang w:val="en-US"/>
-        </w:rPr>
-      </w:pPr>
-      <w:r>
-        <w:rPr>
-          <w:sz w:val="32"/>
-          <w:szCs w:val="32"/>
-          <w:lang w:val="en-US"/>
-        </w:rPr>
-        <w:t>Gravestone</w:t>
-      </w:r>
-    </w:p>
-    <w:p>
-      <w:pPr>
-        <w:rPr>
-          <w:sz w:val="32"/>
-          <w:szCs w:val="32"/>
-          <w:lang w:val="en-US"/>
-        </w:rPr>
-      </w:pPr>
-      <w:r>
-        <w:rPr>
-          <w:sz w:val="32"/>
-          <w:szCs w:val="32"/>
-          <w:lang w:val="en-US"/>
-        </w:rPr>
-        <w:t xml:space="preserve">Ferrite Core </w:t>
-      </w:r>
-      <w:r>
-        <w:rPr>
-          <w:sz w:val="32"/>
-          <w:szCs w:val="32"/>
-          <w:lang w:val="en-US"/>
-        </w:rPr>
-        <w:t>(</w:t>
+        <w:t>GPU</w:t>
+      </w:r>
+      <w:r>
+        <w:rPr>
+          <w:sz w:val="32"/>
+          <w:szCs w:val="32"/>
+          <w:lang w:val="en-US"/>
+        </w:rPr>
+        <w:t xml:space="preserve"> </w:t>
+      </w:r>
+      <w:r>
+        <w:rPr>
+          <w:sz w:val="32"/>
+          <w:szCs w:val="32"/>
+          <w:lang w:val="en-US"/>
+        </w:rPr>
+        <w:t>Tape</w:t>
+      </w:r>
+      <w:r>
+        <w:rPr>
+          <w:sz w:val="32"/>
+          <w:szCs w:val="32"/>
+          <w:lang w:val="en-US"/>
+        </w:rPr>
+        <w:t xml:space="preserve"> (</w:t>
       </w:r>
       <w:r>
         <w:rPr>
@@ -1135,421 +1644,6 @@
           <w:szCs w:val="32"/>
           <w:lang w:val="en-US"/>
         </w:rPr>
-        <w:t>ModernF</w:t>
-      </w:r>
-      <w:r>
-        <w:rPr>
-          <w:sz w:val="32"/>
-          <w:szCs w:val="32"/>
-          <w:lang w:val="en-US"/>
-        </w:rPr>
-        <w:t>i</w:t>
-      </w:r>
-      <w:r>
-        <w:rPr>
-          <w:sz w:val="32"/>
-          <w:szCs w:val="32"/>
-          <w:lang w:val="en-US"/>
-        </w:rPr>
-        <w:t xml:space="preserve">x </w:t>
-      </w:r>
-      <w:r>
-        <w:rPr>
-          <w:sz w:val="32"/>
-          <w:szCs w:val="32"/>
-          <w:lang w:val="en-US"/>
-        </w:rPr>
-        <w:t>(</w:t>
-      </w:r>
-      <w:r>
-        <w:rPr>
-          <w:sz w:val="32"/>
-          <w:szCs w:val="32"/>
-        </w:rPr>
-        <w:t>ОПТИМИЗАЦИЯ</w:t>
-      </w:r>
-      <w:r>
-        <w:rPr>
-          <w:sz w:val="32"/>
-          <w:szCs w:val="32"/>
-          <w:lang w:val="en-US"/>
-        </w:rPr>
-        <w:t>)</w:t>
-      </w:r>
-    </w:p>
-    <w:p>
-      <w:pPr>
-        <w:rPr>
-          <w:sz w:val="32"/>
-          <w:szCs w:val="32"/>
-          <w:lang w:val="en-US"/>
-        </w:rPr>
-      </w:pPr>
-      <w:r>
-        <w:rPr>
-          <w:sz w:val="32"/>
-          <w:szCs w:val="32"/>
-          <w:lang w:val="en-US"/>
-        </w:rPr>
-        <w:t>GlobalXP</w:t>
-      </w:r>
-    </w:p>
-    <w:p>
-      <w:pPr>
-        <w:rPr>
-          <w:sz w:val="32"/>
-          <w:szCs w:val="32"/>
-          <w:lang w:val="en-US"/>
-        </w:rPr>
-      </w:pPr>
-      <w:r>
-        <w:rPr>
-          <w:sz w:val="32"/>
-          <w:szCs w:val="32"/>
-          <w:lang w:val="en-US"/>
-        </w:rPr>
-        <w:t>Multi Mine</w:t>
-      </w:r>
-    </w:p>
-    <w:p>
-      <w:pPr>
-        <w:rPr>
-          <w:sz w:val="32"/>
-          <w:szCs w:val="32"/>
-          <w:lang w:val="en-US"/>
-        </w:rPr>
-      </w:pPr>
-      <w:r>
-        <w:rPr>
-          <w:sz w:val="32"/>
-          <w:szCs w:val="32"/>
-          <w:lang w:val="en-US"/>
-        </w:rPr>
-        <w:t>Sound Physics Remastered</w:t>
-      </w:r>
-    </w:p>
-    <w:p>
-      <w:pPr>
-        <w:rPr>
-          <w:sz w:val="32"/>
-          <w:szCs w:val="32"/>
-          <w:lang w:val="en-US"/>
-        </w:rPr>
-      </w:pPr>
-      <w:r>
-        <w:rPr>
-          <w:sz w:val="32"/>
-          <w:szCs w:val="32"/>
-          <w:lang w:val="en-US"/>
-        </w:rPr>
-        <w:t>Antique Atlas</w:t>
-      </w:r>
-    </w:p>
-    <w:p>
-      <w:pPr>
-        <w:rPr>
-          <w:sz w:val="32"/>
-          <w:szCs w:val="32"/>
-          <w:lang w:val="en-US"/>
-        </w:rPr>
-      </w:pPr>
-      <w:r>
-        <w:rPr>
-          <w:sz w:val="32"/>
-          <w:szCs w:val="32"/>
-          <w:lang w:val="en-US"/>
-        </w:rPr>
-        <w:t>Ice and Fire</w:t>
-      </w:r>
-    </w:p>
-    <w:p>
-      <w:pPr>
-        <w:rPr>
-          <w:sz w:val="32"/>
-          <w:szCs w:val="32"/>
-          <w:lang w:val="en-US"/>
-        </w:rPr>
-      </w:pPr>
-      <w:r>
-        <w:rPr>
-          <w:sz w:val="32"/>
-          <w:szCs w:val="32"/>
-          <w:lang w:val="en-US"/>
-        </w:rPr>
-        <w:t>EFM Compat</w:t>
-      </w:r>
-    </w:p>
-    <w:p>
-      <w:pPr>
-        <w:rPr>
-          <w:sz w:val="32"/>
-          <w:szCs w:val="32"/>
-          <w:lang w:val="en-US"/>
-        </w:rPr>
-      </w:pPr>
-      <w:r>
-        <w:rPr>
-          <w:sz w:val="32"/>
-          <w:szCs w:val="32"/>
-          <w:lang w:val="en-US"/>
-        </w:rPr>
-        <w:t>Visual Keybinder</w:t>
-      </w:r>
-    </w:p>
-    <w:p>
-      <w:pPr>
-        <w:rPr>
-          <w:sz w:val="32"/>
-          <w:szCs w:val="32"/>
-          <w:lang w:val="en-US"/>
-        </w:rPr>
-      </w:pPr>
-      <w:r>
-        <w:rPr>
-          <w:sz w:val="32"/>
-          <w:szCs w:val="32"/>
-          <w:lang w:val="en-US"/>
-        </w:rPr>
-        <w:t>Custom Mob Attributes (</w:t>
-      </w:r>
-      <w:r>
-        <w:rPr>
-          <w:sz w:val="32"/>
-          <w:szCs w:val="32"/>
-        </w:rPr>
-        <w:t>НАСТРОЙКА</w:t>
-      </w:r>
-      <w:r>
-        <w:rPr>
-          <w:sz w:val="32"/>
-          <w:szCs w:val="32"/>
-          <w:lang w:val="en-US"/>
-        </w:rPr>
-        <w:t xml:space="preserve"> </w:t>
-      </w:r>
-      <w:r>
-        <w:rPr>
-          <w:sz w:val="32"/>
-          <w:szCs w:val="32"/>
-        </w:rPr>
-        <w:t>МОБОВ</w:t>
-      </w:r>
-      <w:r>
-        <w:rPr>
-          <w:sz w:val="32"/>
-          <w:szCs w:val="32"/>
-          <w:lang w:val="en-US"/>
-        </w:rPr>
-        <w:t>)</w:t>
-      </w:r>
-    </w:p>
-    <w:p>
-      <w:pPr>
-        <w:rPr>
-          <w:sz w:val="32"/>
-          <w:szCs w:val="32"/>
-          <w:lang w:val="en-US"/>
-        </w:rPr>
-      </w:pPr>
-      <w:r>
-        <w:rPr>
-          <w:sz w:val="32"/>
-          <w:szCs w:val="32"/>
-          <w:lang w:val="en-US"/>
-        </w:rPr>
-        <w:t>Born in Chaos</w:t>
-      </w:r>
-    </w:p>
-    <w:p>
-      <w:pPr>
-        <w:rPr>
-          <w:sz w:val="32"/>
-          <w:szCs w:val="32"/>
-          <w:lang w:val="en-US"/>
-        </w:rPr>
-      </w:pPr>
-      <w:r>
-        <w:rPr>
-          <w:sz w:val="32"/>
-          <w:szCs w:val="32"/>
-          <w:lang w:val="en-US"/>
-        </w:rPr>
-        <w:t>Embeddium (</w:t>
-      </w:r>
-      <w:r>
-        <w:rPr>
-          <w:sz w:val="32"/>
-          <w:szCs w:val="32"/>
-        </w:rPr>
-        <w:t>ИНТЕРФЕЙС</w:t>
-      </w:r>
-      <w:r>
-        <w:rPr>
-          <w:sz w:val="32"/>
-          <w:szCs w:val="32"/>
-          <w:lang w:val="en-US"/>
-        </w:rPr>
-        <w:t xml:space="preserve"> </w:t>
-      </w:r>
-      <w:r>
-        <w:rPr>
-          <w:sz w:val="32"/>
-          <w:szCs w:val="32"/>
-        </w:rPr>
-        <w:t>ШЕЙДЕРОВ</w:t>
-      </w:r>
-      <w:r>
-        <w:rPr>
-          <w:sz w:val="32"/>
-          <w:szCs w:val="32"/>
-          <w:lang w:val="en-US"/>
-        </w:rPr>
-        <w:t>)</w:t>
-      </w:r>
-    </w:p>
-    <w:p>
-      <w:pPr>
-        <w:rPr>
-          <w:sz w:val="32"/>
-          <w:szCs w:val="32"/>
-          <w:lang w:val="en-US"/>
-        </w:rPr>
-      </w:pPr>
-      <w:r>
-        <w:rPr>
-          <w:sz w:val="32"/>
-          <w:szCs w:val="32"/>
-          <w:lang w:val="en-US"/>
-        </w:rPr>
-        <w:t>Starlight (</w:t>
-      </w:r>
-      <w:r>
-        <w:rPr>
-          <w:sz w:val="32"/>
-          <w:szCs w:val="32"/>
-        </w:rPr>
-        <w:t>ОПТИМИЗАЦИЯ</w:t>
-      </w:r>
-      <w:r>
-        <w:rPr>
-          <w:sz w:val="32"/>
-          <w:szCs w:val="32"/>
-          <w:lang w:val="en-US"/>
-        </w:rPr>
-        <w:t>)</w:t>
-      </w:r>
-    </w:p>
-    <w:p>
-      <w:pPr>
-        <w:rPr>
-          <w:sz w:val="32"/>
-          <w:szCs w:val="32"/>
-          <w:lang w:val="en-US"/>
-        </w:rPr>
-      </w:pPr>
-      <w:r>
-        <w:rPr>
-          <w:sz w:val="32"/>
-          <w:szCs w:val="32"/>
-          <w:lang w:val="en-US"/>
-        </w:rPr>
-        <w:t>Canary</w:t>
-      </w:r>
-      <w:r>
-        <w:rPr>
-          <w:sz w:val="32"/>
-          <w:szCs w:val="32"/>
-          <w:lang w:val="en-US"/>
-        </w:rPr>
-        <w:t xml:space="preserve"> (</w:t>
-      </w:r>
-      <w:r>
-        <w:rPr>
-          <w:sz w:val="32"/>
-          <w:szCs w:val="32"/>
-        </w:rPr>
-        <w:t>ОПТИМИЗАЦИЯ</w:t>
-      </w:r>
-      <w:r>
-        <w:rPr>
-          <w:sz w:val="32"/>
-          <w:szCs w:val="32"/>
-          <w:lang w:val="en-US"/>
-        </w:rPr>
-        <w:t>)</w:t>
-      </w:r>
-    </w:p>
-    <w:p>
-      <w:pPr>
-        <w:rPr>
-          <w:sz w:val="32"/>
-          <w:szCs w:val="32"/>
-          <w:lang w:val="en-US"/>
-        </w:rPr>
-      </w:pPr>
-      <w:r>
-        <w:rPr>
-          <w:sz w:val="32"/>
-          <w:szCs w:val="32"/>
-          <w:lang w:val="en-US"/>
-        </w:rPr>
-        <w:t>GPU</w:t>
-      </w:r>
-      <w:r>
-        <w:rPr>
-          <w:sz w:val="32"/>
-          <w:szCs w:val="32"/>
-          <w:lang w:val="en-US"/>
-        </w:rPr>
-        <w:t xml:space="preserve"> </w:t>
-      </w:r>
-      <w:r>
-        <w:rPr>
-          <w:sz w:val="32"/>
-          <w:szCs w:val="32"/>
-          <w:lang w:val="en-US"/>
-        </w:rPr>
-        <w:t>Tape</w:t>
-      </w:r>
-      <w:r>
-        <w:rPr>
-          <w:sz w:val="32"/>
-          <w:szCs w:val="32"/>
-          <w:lang w:val="en-US"/>
-        </w:rPr>
-        <w:t xml:space="preserve"> (</w:t>
-      </w:r>
-      <w:r>
-        <w:rPr>
-          <w:sz w:val="32"/>
-          <w:szCs w:val="32"/>
-        </w:rPr>
-        <w:t>ОПТИМИЗАЦИЯ</w:t>
-      </w:r>
-      <w:r>
-        <w:rPr>
-          <w:sz w:val="32"/>
-          <w:szCs w:val="32"/>
-          <w:lang w:val="en-US"/>
-        </w:rPr>
-        <w:t>)</w:t>
-      </w:r>
-    </w:p>
-    <w:p>
-      <w:pPr>
-        <w:rPr>
-          <w:sz w:val="32"/>
-          <w:szCs w:val="32"/>
-          <w:lang w:val="en-US"/>
-        </w:rPr>
-      </w:pPr>
-      <w:r>
-        <w:rPr>
-          <w:sz w:val="32"/>
-          <w:szCs w:val="32"/>
-          <w:lang w:val="en-US"/>
-        </w:rPr>
-        <w:lastRenderedPageBreak/>
         <w:t>Dynamic</w:t>
       </w:r>
       <w:r>
@@ -2192,23 +2286,7 @@
           <w:szCs w:val="32"/>
           <w:lang w:val="en-US"/>
         </w:rPr>
-        <w:t>Union Lib</w:t>
-      </w:r>
-    </w:p>
-    <w:p>
-      <w:pPr>
-        <w:rPr>
-          <w:sz w:val="32"/>
-          <w:szCs w:val="32"/>
-          <w:lang w:val="en-US"/>
-        </w:rPr>
-      </w:pPr>
-      <w:r>
-        <w:rPr>
-          <w:sz w:val="32"/>
-          <w:szCs w:val="32"/>
-          <w:lang w:val="en-US"/>
-        </w:rPr>
+        <w:lastRenderedPageBreak/>
         <w:t>Cupboard</w:t>
       </w:r>
     </w:p>
@@ -2226,7 +2304,6 @@
           <w:szCs w:val="32"/>
           <w:lang w:val="en-US"/>
         </w:rPr>
-        <w:lastRenderedPageBreak/>
         <w:t>SLLibrary</w:t>
       </w:r>
     </w:p>

</xml_diff>